<commit_message>
hero carousel removed and single wallpaper applied
</commit_message>
<xml_diff>
--- a/quebec_newcomer_hiring_article.docx
+++ b/quebec_newcomer_hiring_article.docx
@@ -438,11 +438,23 @@
         <w:spacing w:after="160"/>
       </w:pPr>
       <w:r>
-        <w:t>Anooj Dhawan is a content and outreach professional working with Commonwealth Migration Group Inc. He supports communications and editorial partnerships relating to newcomer and relocation information. His work focuses on practical, source-led writing for people making work, business, and settlement decisions in Canada.</w:t>
+        <w:t xml:space="preserve">Anooj Dhawan is a content and outreach professional working with Commonwealth Migration Group Inc. He supports communications and editorial partnerships relating to newcomer and relocation information. His work focuses on practical, source-led writing for people making work, business, and settlement decisions in Canada. For related reader guidance, see </w:t>
+      </w:r>
+      <w:hyperlink r:id="rId13">
+        <w:r>
+          <w:rPr>
+            <w:color w:val="1F4E79"/>
+            <w:u w:val="single"/>
+          </w:rPr>
+          <w:t>Canada work permit information</w:t>
+        </w:r>
+      </w:hyperlink>
+      <w:r>
+        <w:t>.</w:t>
       </w:r>
     </w:p>
     <w:sectPr>
-      <w:footerReference w:type="default" r:id="rId13"/>
+      <w:footerReference w:type="default" r:id="rId14"/>
       <w:pgSz w:w="12240" w:h="15840"/>
       <w:pgMar w:top="1080" w:right="1224" w:bottom="1008" w:left="1224" w:header="720" w:footer="720" w:gutter="0"/>
       <w:cols w:space="720"/>

</xml_diff>